<commit_message>
ajusta navegação e tabelas da prática A01
</commit_message>
<xml_diff>
--- a/atividades/A01-o-incidente-que-parou-a-linha/fonte/A01-o-incidente-que-parou-a-linha.docx
+++ b/atividades/A01-o-incidente-que-parou-a-linha/fonte/A01-o-incidente-que-parou-a-linha.docx
@@ -40,7 +40,7 @@
     </w:p>
     <w:tbl>
       <w:tblPr>
-        <w:tblW w:type="pct" w:w="100%"/>
+        <w:tblW w:type="dxa" w:w="10300"/>
         <w:tblBorders>
           <w:top w:val="single" w:color="auto" w:sz="4"/>
           <w:left w:val="single" w:color="auto" w:sz="4"/>
@@ -51,19 +51,20 @@
         </w:tblBorders>
       </w:tblPr>
       <w:tblGrid>
-        <w:gridCol w:w="100"/>
-        <w:gridCol w:w="100"/>
-        <w:gridCol w:w="100"/>
+        <w:gridCol w:w="3400"/>
+        <w:gridCol w:w="3400"/>
+        <w:gridCol w:w="3500"/>
       </w:tblGrid>
       <w:tr>
         <w:tc>
           <w:tcPr>
+            <w:tcW w:type="dxa" w:w="3400"/>
             <w:shd w:fill="E7F0F8" w:val="clear"/>
             <w:tcMar>
               <w:top w:type="dxa" w:w="130"/>
-              <w:left w:type="dxa" w:w="150"/>
-              <w:bottom w:type="dxa" w:w="130"/>
-              <w:right w:type="dxa" w:w="150"/>
+              <w:left w:type="dxa" w:w="170"/>
+              <w:bottom w:type="dxa" w:w="130"/>
+              <w:right w:type="dxa" w:w="170"/>
             </w:tcMar>
           </w:tcPr>
           <w:p>
@@ -85,12 +86,13 @@
         </w:tc>
         <w:tc>
           <w:tcPr>
+            <w:tcW w:type="dxa" w:w="3400"/>
             <w:shd w:fill="E7F0F8" w:val="clear"/>
             <w:tcMar>
               <w:top w:type="dxa" w:w="130"/>
-              <w:left w:type="dxa" w:w="150"/>
-              <w:bottom w:type="dxa" w:w="130"/>
-              <w:right w:type="dxa" w:w="150"/>
+              <w:left w:type="dxa" w:w="170"/>
+              <w:bottom w:type="dxa" w:w="130"/>
+              <w:right w:type="dxa" w:w="170"/>
             </w:tcMar>
           </w:tcPr>
           <w:p>
@@ -112,12 +114,13 @@
         </w:tc>
         <w:tc>
           <w:tcPr>
+            <w:tcW w:type="dxa" w:w="3500"/>
             <w:shd w:fill="E7F0F8" w:val="clear"/>
             <w:tcMar>
               <w:top w:type="dxa" w:w="130"/>
-              <w:left w:type="dxa" w:w="150"/>
-              <w:bottom w:type="dxa" w:w="130"/>
-              <w:right w:type="dxa" w:w="150"/>
+              <w:left w:type="dxa" w:w="170"/>
+              <w:bottom w:type="dxa" w:w="130"/>
+              <w:right w:type="dxa" w:w="170"/>
             </w:tcMar>
           </w:tcPr>
           <w:p>
@@ -421,7 +424,7 @@
     </w:p>
     <w:tbl>
       <w:tblPr>
-        <w:tblW w:type="pct" w:w="100%"/>
+        <w:tblW w:type="dxa" w:w="10300"/>
         <w:tblBorders>
           <w:top w:val="single" w:color="auto" w:sz="4"/>
           <w:left w:val="single" w:color="auto" w:sz="4"/>
@@ -432,9 +435,9 @@
         </w:tblBorders>
       </w:tblPr>
       <w:tblGrid>
-        <w:gridCol w:w="100"/>
-        <w:gridCol w:w="100"/>
-        <w:gridCol w:w="100"/>
+        <w:gridCol w:w="1600"/>
+        <w:gridCol w:w="1900"/>
+        <w:gridCol w:w="6800"/>
       </w:tblGrid>
       <w:tr>
         <w:trPr>
@@ -442,12 +445,13 @@
         </w:trPr>
         <w:tc>
           <w:tcPr>
+            <w:tcW w:type="dxa" w:w="1600"/>
             <w:shd w:fill="12304A" w:val="clear"/>
             <w:tcMar>
               <w:top w:type="dxa" w:w="130"/>
-              <w:left w:type="dxa" w:w="150"/>
-              <w:bottom w:type="dxa" w:w="130"/>
-              <w:right w:type="dxa" w:w="150"/>
+              <w:left w:type="dxa" w:w="170"/>
+              <w:bottom w:type="dxa" w:w="130"/>
+              <w:right w:type="dxa" w:w="170"/>
             </w:tcMar>
           </w:tcPr>
           <w:p>
@@ -468,12 +472,13 @@
         </w:tc>
         <w:tc>
           <w:tcPr>
+            <w:tcW w:type="dxa" w:w="1900"/>
             <w:shd w:fill="12304A" w:val="clear"/>
             <w:tcMar>
               <w:top w:type="dxa" w:w="130"/>
-              <w:left w:type="dxa" w:w="150"/>
-              <w:bottom w:type="dxa" w:w="130"/>
-              <w:right w:type="dxa" w:w="150"/>
+              <w:left w:type="dxa" w:w="170"/>
+              <w:bottom w:type="dxa" w:w="130"/>
+              <w:right w:type="dxa" w:w="170"/>
             </w:tcMar>
           </w:tcPr>
           <w:p>
@@ -494,12 +499,13 @@
         </w:tc>
         <w:tc>
           <w:tcPr>
+            <w:tcW w:type="dxa" w:w="6800"/>
             <w:shd w:fill="12304A" w:val="clear"/>
             <w:tcMar>
               <w:top w:type="dxa" w:w="130"/>
-              <w:left w:type="dxa" w:w="150"/>
-              <w:bottom w:type="dxa" w:w="130"/>
-              <w:right w:type="dxa" w:w="150"/>
+              <w:left w:type="dxa" w:w="170"/>
+              <w:bottom w:type="dxa" w:w="130"/>
+              <w:right w:type="dxa" w:w="170"/>
             </w:tcMar>
           </w:tcPr>
           <w:p>
@@ -522,12 +528,13 @@
       <w:tr>
         <w:tc>
           <w:tcPr>
-            <w:shd w:fill="FFFFFF" w:val="clear"/>
-            <w:tcMar>
-              <w:top w:type="dxa" w:w="130"/>
-              <w:left w:type="dxa" w:w="150"/>
-              <w:bottom w:type="dxa" w:w="130"/>
-              <w:right w:type="dxa" w:w="150"/>
+            <w:tcW w:type="dxa" w:w="1600"/>
+            <w:shd w:fill="FFFFFF" w:val="clear"/>
+            <w:tcMar>
+              <w:top w:type="dxa" w:w="130"/>
+              <w:left w:type="dxa" w:w="170"/>
+              <w:bottom w:type="dxa" w:w="130"/>
+              <w:right w:type="dxa" w:w="170"/>
             </w:tcMar>
           </w:tcPr>
           <w:p>
@@ -548,12 +555,13 @@
         </w:tc>
         <w:tc>
           <w:tcPr>
-            <w:shd w:fill="FFFFFF" w:val="clear"/>
-            <w:tcMar>
-              <w:top w:type="dxa" w:w="130"/>
-              <w:left w:type="dxa" w:w="150"/>
-              <w:bottom w:type="dxa" w:w="130"/>
-              <w:right w:type="dxa" w:w="150"/>
+            <w:tcW w:type="dxa" w:w="1900"/>
+            <w:shd w:fill="FFFFFF" w:val="clear"/>
+            <w:tcMar>
+              <w:top w:type="dxa" w:w="130"/>
+              <w:left w:type="dxa" w:w="170"/>
+              <w:bottom w:type="dxa" w:w="130"/>
+              <w:right w:type="dxa" w:w="170"/>
             </w:tcMar>
           </w:tcPr>
           <w:p>
@@ -574,12 +582,13 @@
         </w:tc>
         <w:tc>
           <w:tcPr>
-            <w:shd w:fill="FFFFFF" w:val="clear"/>
-            <w:tcMar>
-              <w:top w:type="dxa" w:w="130"/>
-              <w:left w:type="dxa" w:w="150"/>
-              <w:bottom w:type="dxa" w:w="130"/>
-              <w:right w:type="dxa" w:w="150"/>
+            <w:tcW w:type="dxa" w:w="6800"/>
+            <w:shd w:fill="FFFFFF" w:val="clear"/>
+            <w:tcMar>
+              <w:top w:type="dxa" w:w="130"/>
+              <w:left w:type="dxa" w:w="170"/>
+              <w:bottom w:type="dxa" w:w="130"/>
+              <w:right w:type="dxa" w:w="170"/>
             </w:tcMar>
           </w:tcPr>
           <w:p>
@@ -602,12 +611,13 @@
       <w:tr>
         <w:tc>
           <w:tcPr>
-            <w:shd w:fill="FFFFFF" w:val="clear"/>
-            <w:tcMar>
-              <w:top w:type="dxa" w:w="130"/>
-              <w:left w:type="dxa" w:w="150"/>
-              <w:bottom w:type="dxa" w:w="130"/>
-              <w:right w:type="dxa" w:w="150"/>
+            <w:tcW w:type="dxa" w:w="1600"/>
+            <w:shd w:fill="FFFFFF" w:val="clear"/>
+            <w:tcMar>
+              <w:top w:type="dxa" w:w="130"/>
+              <w:left w:type="dxa" w:w="170"/>
+              <w:bottom w:type="dxa" w:w="130"/>
+              <w:right w:type="dxa" w:w="170"/>
             </w:tcMar>
           </w:tcPr>
           <w:p>
@@ -628,12 +638,13 @@
         </w:tc>
         <w:tc>
           <w:tcPr>
-            <w:shd w:fill="FFFFFF" w:val="clear"/>
-            <w:tcMar>
-              <w:top w:type="dxa" w:w="130"/>
-              <w:left w:type="dxa" w:w="150"/>
-              <w:bottom w:type="dxa" w:w="130"/>
-              <w:right w:type="dxa" w:w="150"/>
+            <w:tcW w:type="dxa" w:w="1900"/>
+            <w:shd w:fill="FFFFFF" w:val="clear"/>
+            <w:tcMar>
+              <w:top w:type="dxa" w:w="130"/>
+              <w:left w:type="dxa" w:w="170"/>
+              <w:bottom w:type="dxa" w:w="130"/>
+              <w:right w:type="dxa" w:w="170"/>
             </w:tcMar>
           </w:tcPr>
           <w:p>
@@ -654,12 +665,13 @@
         </w:tc>
         <w:tc>
           <w:tcPr>
-            <w:shd w:fill="FFFFFF" w:val="clear"/>
-            <w:tcMar>
-              <w:top w:type="dxa" w:w="130"/>
-              <w:left w:type="dxa" w:w="150"/>
-              <w:bottom w:type="dxa" w:w="130"/>
-              <w:right w:type="dxa" w:w="150"/>
+            <w:tcW w:type="dxa" w:w="6800"/>
+            <w:shd w:fill="FFFFFF" w:val="clear"/>
+            <w:tcMar>
+              <w:top w:type="dxa" w:w="130"/>
+              <w:left w:type="dxa" w:w="170"/>
+              <w:bottom w:type="dxa" w:w="130"/>
+              <w:right w:type="dxa" w:w="170"/>
             </w:tcMar>
           </w:tcPr>
           <w:p>
@@ -682,12 +694,13 @@
       <w:tr>
         <w:tc>
           <w:tcPr>
-            <w:shd w:fill="FFFFFF" w:val="clear"/>
-            <w:tcMar>
-              <w:top w:type="dxa" w:w="130"/>
-              <w:left w:type="dxa" w:w="150"/>
-              <w:bottom w:type="dxa" w:w="130"/>
-              <w:right w:type="dxa" w:w="150"/>
+            <w:tcW w:type="dxa" w:w="1600"/>
+            <w:shd w:fill="FFFFFF" w:val="clear"/>
+            <w:tcMar>
+              <w:top w:type="dxa" w:w="130"/>
+              <w:left w:type="dxa" w:w="170"/>
+              <w:bottom w:type="dxa" w:w="130"/>
+              <w:right w:type="dxa" w:w="170"/>
             </w:tcMar>
           </w:tcPr>
           <w:p>
@@ -708,12 +721,13 @@
         </w:tc>
         <w:tc>
           <w:tcPr>
-            <w:shd w:fill="FFFFFF" w:val="clear"/>
-            <w:tcMar>
-              <w:top w:type="dxa" w:w="130"/>
-              <w:left w:type="dxa" w:w="150"/>
-              <w:bottom w:type="dxa" w:w="130"/>
-              <w:right w:type="dxa" w:w="150"/>
+            <w:tcW w:type="dxa" w:w="1900"/>
+            <w:shd w:fill="FFFFFF" w:val="clear"/>
+            <w:tcMar>
+              <w:top w:type="dxa" w:w="130"/>
+              <w:left w:type="dxa" w:w="170"/>
+              <w:bottom w:type="dxa" w:w="130"/>
+              <w:right w:type="dxa" w:w="170"/>
             </w:tcMar>
           </w:tcPr>
           <w:p>
@@ -734,12 +748,13 @@
         </w:tc>
         <w:tc>
           <w:tcPr>
-            <w:shd w:fill="FFFFFF" w:val="clear"/>
-            <w:tcMar>
-              <w:top w:type="dxa" w:w="130"/>
-              <w:left w:type="dxa" w:w="150"/>
-              <w:bottom w:type="dxa" w:w="130"/>
-              <w:right w:type="dxa" w:w="150"/>
+            <w:tcW w:type="dxa" w:w="6800"/>
+            <w:shd w:fill="FFFFFF" w:val="clear"/>
+            <w:tcMar>
+              <w:top w:type="dxa" w:w="130"/>
+              <w:left w:type="dxa" w:w="170"/>
+              <w:bottom w:type="dxa" w:w="130"/>
+              <w:right w:type="dxa" w:w="170"/>
             </w:tcMar>
           </w:tcPr>
           <w:p>
@@ -762,12 +777,13 @@
       <w:tr>
         <w:tc>
           <w:tcPr>
-            <w:shd w:fill="FFFFFF" w:val="clear"/>
-            <w:tcMar>
-              <w:top w:type="dxa" w:w="130"/>
-              <w:left w:type="dxa" w:w="150"/>
-              <w:bottom w:type="dxa" w:w="130"/>
-              <w:right w:type="dxa" w:w="150"/>
+            <w:tcW w:type="dxa" w:w="1600"/>
+            <w:shd w:fill="FFFFFF" w:val="clear"/>
+            <w:tcMar>
+              <w:top w:type="dxa" w:w="130"/>
+              <w:left w:type="dxa" w:w="170"/>
+              <w:bottom w:type="dxa" w:w="130"/>
+              <w:right w:type="dxa" w:w="170"/>
             </w:tcMar>
           </w:tcPr>
           <w:p>
@@ -788,12 +804,13 @@
         </w:tc>
         <w:tc>
           <w:tcPr>
-            <w:shd w:fill="FFFFFF" w:val="clear"/>
-            <w:tcMar>
-              <w:top w:type="dxa" w:w="130"/>
-              <w:left w:type="dxa" w:w="150"/>
-              <w:bottom w:type="dxa" w:w="130"/>
-              <w:right w:type="dxa" w:w="150"/>
+            <w:tcW w:type="dxa" w:w="1900"/>
+            <w:shd w:fill="FFFFFF" w:val="clear"/>
+            <w:tcMar>
+              <w:top w:type="dxa" w:w="130"/>
+              <w:left w:type="dxa" w:w="170"/>
+              <w:bottom w:type="dxa" w:w="130"/>
+              <w:right w:type="dxa" w:w="170"/>
             </w:tcMar>
           </w:tcPr>
           <w:p>
@@ -814,12 +831,13 @@
         </w:tc>
         <w:tc>
           <w:tcPr>
-            <w:shd w:fill="FFFFFF" w:val="clear"/>
-            <w:tcMar>
-              <w:top w:type="dxa" w:w="130"/>
-              <w:left w:type="dxa" w:w="150"/>
-              <w:bottom w:type="dxa" w:w="130"/>
-              <w:right w:type="dxa" w:w="150"/>
+            <w:tcW w:type="dxa" w:w="6800"/>
+            <w:shd w:fill="FFFFFF" w:val="clear"/>
+            <w:tcMar>
+              <w:top w:type="dxa" w:w="130"/>
+              <w:left w:type="dxa" w:w="170"/>
+              <w:bottom w:type="dxa" w:w="130"/>
+              <w:right w:type="dxa" w:w="170"/>
             </w:tcMar>
           </w:tcPr>
           <w:p>
@@ -842,12 +860,13 @@
       <w:tr>
         <w:tc>
           <w:tcPr>
-            <w:shd w:fill="FFFFFF" w:val="clear"/>
-            <w:tcMar>
-              <w:top w:type="dxa" w:w="130"/>
-              <w:left w:type="dxa" w:w="150"/>
-              <w:bottom w:type="dxa" w:w="130"/>
-              <w:right w:type="dxa" w:w="150"/>
+            <w:tcW w:type="dxa" w:w="1600"/>
+            <w:shd w:fill="FFFFFF" w:val="clear"/>
+            <w:tcMar>
+              <w:top w:type="dxa" w:w="130"/>
+              <w:left w:type="dxa" w:w="170"/>
+              <w:bottom w:type="dxa" w:w="130"/>
+              <w:right w:type="dxa" w:w="170"/>
             </w:tcMar>
           </w:tcPr>
           <w:p>
@@ -868,12 +887,13 @@
         </w:tc>
         <w:tc>
           <w:tcPr>
-            <w:shd w:fill="FFFFFF" w:val="clear"/>
-            <w:tcMar>
-              <w:top w:type="dxa" w:w="130"/>
-              <w:left w:type="dxa" w:w="150"/>
-              <w:bottom w:type="dxa" w:w="130"/>
-              <w:right w:type="dxa" w:w="150"/>
+            <w:tcW w:type="dxa" w:w="1900"/>
+            <w:shd w:fill="FFFFFF" w:val="clear"/>
+            <w:tcMar>
+              <w:top w:type="dxa" w:w="130"/>
+              <w:left w:type="dxa" w:w="170"/>
+              <w:bottom w:type="dxa" w:w="130"/>
+              <w:right w:type="dxa" w:w="170"/>
             </w:tcMar>
           </w:tcPr>
           <w:p>
@@ -894,12 +914,13 @@
         </w:tc>
         <w:tc>
           <w:tcPr>
-            <w:shd w:fill="FFFFFF" w:val="clear"/>
-            <w:tcMar>
-              <w:top w:type="dxa" w:w="130"/>
-              <w:left w:type="dxa" w:w="150"/>
-              <w:bottom w:type="dxa" w:w="130"/>
-              <w:right w:type="dxa" w:w="150"/>
+            <w:tcW w:type="dxa" w:w="6800"/>
+            <w:shd w:fill="FFFFFF" w:val="clear"/>
+            <w:tcMar>
+              <w:top w:type="dxa" w:w="130"/>
+              <w:left w:type="dxa" w:w="170"/>
+              <w:bottom w:type="dxa" w:w="130"/>
+              <w:right w:type="dxa" w:w="170"/>
             </w:tcMar>
           </w:tcPr>
           <w:p>
@@ -1002,7 +1023,7 @@
     </w:p>
     <w:tbl>
       <w:tblPr>
-        <w:tblW w:type="pct" w:w="100%"/>
+        <w:tblW w:type="dxa" w:w="10300"/>
         <w:tblBorders>
           <w:top w:val="single" w:color="auto" w:sz="4"/>
           <w:left w:val="single" w:color="auto" w:sz="4"/>
@@ -1013,9 +1034,9 @@
         </w:tblBorders>
       </w:tblPr>
       <w:tblGrid>
-        <w:gridCol w:w="100"/>
-        <w:gridCol w:w="100"/>
-        <w:gridCol w:w="100"/>
+        <w:gridCol w:w="2800"/>
+        <w:gridCol w:w="3500"/>
+        <w:gridCol w:w="4000"/>
       </w:tblGrid>
       <w:tr>
         <w:trPr>
@@ -1023,12 +1044,13 @@
         </w:trPr>
         <w:tc>
           <w:tcPr>
+            <w:tcW w:type="dxa" w:w="2800"/>
             <w:shd w:fill="12304A" w:val="clear"/>
             <w:tcMar>
               <w:top w:type="dxa" w:w="130"/>
-              <w:left w:type="dxa" w:w="150"/>
-              <w:bottom w:type="dxa" w:w="130"/>
-              <w:right w:type="dxa" w:w="150"/>
+              <w:left w:type="dxa" w:w="170"/>
+              <w:bottom w:type="dxa" w:w="130"/>
+              <w:right w:type="dxa" w:w="170"/>
             </w:tcMar>
           </w:tcPr>
           <w:p>
@@ -1049,12 +1071,13 @@
         </w:tc>
         <w:tc>
           <w:tcPr>
+            <w:tcW w:type="dxa" w:w="3500"/>
             <w:shd w:fill="12304A" w:val="clear"/>
             <w:tcMar>
               <w:top w:type="dxa" w:w="130"/>
-              <w:left w:type="dxa" w:w="150"/>
-              <w:bottom w:type="dxa" w:w="130"/>
-              <w:right w:type="dxa" w:w="150"/>
+              <w:left w:type="dxa" w:w="170"/>
+              <w:bottom w:type="dxa" w:w="130"/>
+              <w:right w:type="dxa" w:w="170"/>
             </w:tcMar>
           </w:tcPr>
           <w:p>
@@ -1075,12 +1098,13 @@
         </w:tc>
         <w:tc>
           <w:tcPr>
+            <w:tcW w:type="dxa" w:w="4000"/>
             <w:shd w:fill="12304A" w:val="clear"/>
             <w:tcMar>
               <w:top w:type="dxa" w:w="130"/>
-              <w:left w:type="dxa" w:w="150"/>
-              <w:bottom w:type="dxa" w:w="130"/>
-              <w:right w:type="dxa" w:w="150"/>
+              <w:left w:type="dxa" w:w="170"/>
+              <w:bottom w:type="dxa" w:w="130"/>
+              <w:right w:type="dxa" w:w="170"/>
             </w:tcMar>
           </w:tcPr>
           <w:p>
@@ -1103,12 +1127,13 @@
       <w:tr>
         <w:tc>
           <w:tcPr>
-            <w:shd w:fill="FFFFFF" w:val="clear"/>
-            <w:tcMar>
-              <w:top w:type="dxa" w:w="130"/>
-              <w:left w:type="dxa" w:w="150"/>
-              <w:bottom w:type="dxa" w:w="130"/>
-              <w:right w:type="dxa" w:w="150"/>
+            <w:tcW w:type="dxa" w:w="2800"/>
+            <w:shd w:fill="FFFFFF" w:val="clear"/>
+            <w:tcMar>
+              <w:top w:type="dxa" w:w="130"/>
+              <w:left w:type="dxa" w:w="170"/>
+              <w:bottom w:type="dxa" w:w="130"/>
+              <w:right w:type="dxa" w:w="170"/>
             </w:tcMar>
           </w:tcPr>
           <w:p>
@@ -1129,12 +1154,13 @@
         </w:tc>
         <w:tc>
           <w:tcPr>
-            <w:shd w:fill="FFFFFF" w:val="clear"/>
-            <w:tcMar>
-              <w:top w:type="dxa" w:w="130"/>
-              <w:left w:type="dxa" w:w="150"/>
-              <w:bottom w:type="dxa" w:w="130"/>
-              <w:right w:type="dxa" w:w="150"/>
+            <w:tcW w:type="dxa" w:w="3500"/>
+            <w:shd w:fill="FFFFFF" w:val="clear"/>
+            <w:tcMar>
+              <w:top w:type="dxa" w:w="130"/>
+              <w:left w:type="dxa" w:w="170"/>
+              <w:bottom w:type="dxa" w:w="130"/>
+              <w:right w:type="dxa" w:w="170"/>
             </w:tcMar>
           </w:tcPr>
           <w:p>
@@ -1155,12 +1181,13 @@
         </w:tc>
         <w:tc>
           <w:tcPr>
-            <w:shd w:fill="FFFFFF" w:val="clear"/>
-            <w:tcMar>
-              <w:top w:type="dxa" w:w="130"/>
-              <w:left w:type="dxa" w:w="150"/>
-              <w:bottom w:type="dxa" w:w="130"/>
-              <w:right w:type="dxa" w:w="150"/>
+            <w:tcW w:type="dxa" w:w="4000"/>
+            <w:shd w:fill="FFFFFF" w:val="clear"/>
+            <w:tcMar>
+              <w:top w:type="dxa" w:w="130"/>
+              <w:left w:type="dxa" w:w="170"/>
+              <w:bottom w:type="dxa" w:w="130"/>
+              <w:right w:type="dxa" w:w="170"/>
             </w:tcMar>
           </w:tcPr>
           <w:p>
@@ -1183,12 +1210,13 @@
       <w:tr>
         <w:tc>
           <w:tcPr>
-            <w:shd w:fill="FFFFFF" w:val="clear"/>
-            <w:tcMar>
-              <w:top w:type="dxa" w:w="130"/>
-              <w:left w:type="dxa" w:w="150"/>
-              <w:bottom w:type="dxa" w:w="130"/>
-              <w:right w:type="dxa" w:w="150"/>
+            <w:tcW w:type="dxa" w:w="2800"/>
+            <w:shd w:fill="FFFFFF" w:val="clear"/>
+            <w:tcMar>
+              <w:top w:type="dxa" w:w="130"/>
+              <w:left w:type="dxa" w:w="170"/>
+              <w:bottom w:type="dxa" w:w="130"/>
+              <w:right w:type="dxa" w:w="170"/>
             </w:tcMar>
           </w:tcPr>
           <w:p>
@@ -1209,12 +1237,13 @@
         </w:tc>
         <w:tc>
           <w:tcPr>
-            <w:shd w:fill="FFFFFF" w:val="clear"/>
-            <w:tcMar>
-              <w:top w:type="dxa" w:w="130"/>
-              <w:left w:type="dxa" w:w="150"/>
-              <w:bottom w:type="dxa" w:w="130"/>
-              <w:right w:type="dxa" w:w="150"/>
+            <w:tcW w:type="dxa" w:w="3500"/>
+            <w:shd w:fill="FFFFFF" w:val="clear"/>
+            <w:tcMar>
+              <w:top w:type="dxa" w:w="130"/>
+              <w:left w:type="dxa" w:w="170"/>
+              <w:bottom w:type="dxa" w:w="130"/>
+              <w:right w:type="dxa" w:w="170"/>
             </w:tcMar>
           </w:tcPr>
           <w:p>
@@ -1235,12 +1264,13 @@
         </w:tc>
         <w:tc>
           <w:tcPr>
-            <w:shd w:fill="FFFFFF" w:val="clear"/>
-            <w:tcMar>
-              <w:top w:type="dxa" w:w="130"/>
-              <w:left w:type="dxa" w:w="150"/>
-              <w:bottom w:type="dxa" w:w="130"/>
-              <w:right w:type="dxa" w:w="150"/>
+            <w:tcW w:type="dxa" w:w="4000"/>
+            <w:shd w:fill="FFFFFF" w:val="clear"/>
+            <w:tcMar>
+              <w:top w:type="dxa" w:w="130"/>
+              <w:left w:type="dxa" w:w="170"/>
+              <w:bottom w:type="dxa" w:w="130"/>
+              <w:right w:type="dxa" w:w="170"/>
             </w:tcMar>
           </w:tcPr>
           <w:p>
@@ -1343,7 +1373,7 @@
     </w:p>
     <w:tbl>
       <w:tblPr>
-        <w:tblW w:type="pct" w:w="100%"/>
+        <w:tblW w:type="dxa" w:w="10300"/>
         <w:tblBorders>
           <w:top w:val="single" w:color="auto" w:sz="4"/>
           <w:left w:val="single" w:color="auto" w:sz="4"/>
@@ -1354,10 +1384,10 @@
         </w:tblBorders>
       </w:tblPr>
       <w:tblGrid>
-        <w:gridCol w:w="100"/>
-        <w:gridCol w:w="100"/>
-        <w:gridCol w:w="100"/>
-        <w:gridCol w:w="100"/>
+        <w:gridCol w:w="1900"/>
+        <w:gridCol w:w="2500"/>
+        <w:gridCol w:w="2800"/>
+        <w:gridCol w:w="3100"/>
       </w:tblGrid>
       <w:tr>
         <w:trPr>
@@ -1365,12 +1395,13 @@
         </w:trPr>
         <w:tc>
           <w:tcPr>
+            <w:tcW w:type="dxa" w:w="1900"/>
             <w:shd w:fill="12304A" w:val="clear"/>
             <w:tcMar>
               <w:top w:type="dxa" w:w="130"/>
-              <w:left w:type="dxa" w:w="150"/>
-              <w:bottom w:type="dxa" w:w="130"/>
-              <w:right w:type="dxa" w:w="150"/>
+              <w:left w:type="dxa" w:w="170"/>
+              <w:bottom w:type="dxa" w:w="130"/>
+              <w:right w:type="dxa" w:w="170"/>
             </w:tcMar>
           </w:tcPr>
           <w:p>
@@ -1391,12 +1422,13 @@
         </w:tc>
         <w:tc>
           <w:tcPr>
+            <w:tcW w:type="dxa" w:w="2500"/>
             <w:shd w:fill="12304A" w:val="clear"/>
             <w:tcMar>
               <w:top w:type="dxa" w:w="130"/>
-              <w:left w:type="dxa" w:w="150"/>
-              <w:bottom w:type="dxa" w:w="130"/>
-              <w:right w:type="dxa" w:w="150"/>
+              <w:left w:type="dxa" w:w="170"/>
+              <w:bottom w:type="dxa" w:w="130"/>
+              <w:right w:type="dxa" w:w="170"/>
             </w:tcMar>
           </w:tcPr>
           <w:p>
@@ -1417,12 +1449,13 @@
         </w:tc>
         <w:tc>
           <w:tcPr>
+            <w:tcW w:type="dxa" w:w="2800"/>
             <w:shd w:fill="12304A" w:val="clear"/>
             <w:tcMar>
               <w:top w:type="dxa" w:w="130"/>
-              <w:left w:type="dxa" w:w="150"/>
-              <w:bottom w:type="dxa" w:w="130"/>
-              <w:right w:type="dxa" w:w="150"/>
+              <w:left w:type="dxa" w:w="170"/>
+              <w:bottom w:type="dxa" w:w="130"/>
+              <w:right w:type="dxa" w:w="170"/>
             </w:tcMar>
           </w:tcPr>
           <w:p>
@@ -1443,12 +1476,13 @@
         </w:tc>
         <w:tc>
           <w:tcPr>
+            <w:tcW w:type="dxa" w:w="3100"/>
             <w:shd w:fill="12304A" w:val="clear"/>
             <w:tcMar>
               <w:top w:type="dxa" w:w="130"/>
-              <w:left w:type="dxa" w:w="150"/>
-              <w:bottom w:type="dxa" w:w="130"/>
-              <w:right w:type="dxa" w:w="150"/>
+              <w:left w:type="dxa" w:w="170"/>
+              <w:bottom w:type="dxa" w:w="130"/>
+              <w:right w:type="dxa" w:w="170"/>
             </w:tcMar>
           </w:tcPr>
           <w:p>
@@ -1471,12 +1505,13 @@
       <w:tr>
         <w:tc>
           <w:tcPr>
-            <w:shd w:fill="FFFFFF" w:val="clear"/>
-            <w:tcMar>
-              <w:top w:type="dxa" w:w="130"/>
-              <w:left w:type="dxa" w:w="150"/>
-              <w:bottom w:type="dxa" w:w="130"/>
-              <w:right w:type="dxa" w:w="150"/>
+            <w:tcW w:type="dxa" w:w="1900"/>
+            <w:shd w:fill="FFFFFF" w:val="clear"/>
+            <w:tcMar>
+              <w:top w:type="dxa" w:w="130"/>
+              <w:left w:type="dxa" w:w="170"/>
+              <w:bottom w:type="dxa" w:w="130"/>
+              <w:right w:type="dxa" w:w="170"/>
             </w:tcMar>
           </w:tcPr>
           <w:p>
@@ -1497,12 +1532,13 @@
         </w:tc>
         <w:tc>
           <w:tcPr>
-            <w:shd w:fill="FFFFFF" w:val="clear"/>
-            <w:tcMar>
-              <w:top w:type="dxa" w:w="130"/>
-              <w:left w:type="dxa" w:w="150"/>
-              <w:bottom w:type="dxa" w:w="130"/>
-              <w:right w:type="dxa" w:w="150"/>
+            <w:tcW w:type="dxa" w:w="2500"/>
+            <w:shd w:fill="FFFFFF" w:val="clear"/>
+            <w:tcMar>
+              <w:top w:type="dxa" w:w="130"/>
+              <w:left w:type="dxa" w:w="170"/>
+              <w:bottom w:type="dxa" w:w="130"/>
+              <w:right w:type="dxa" w:w="170"/>
             </w:tcMar>
           </w:tcPr>
           <w:p>
@@ -1523,12 +1559,13 @@
         </w:tc>
         <w:tc>
           <w:tcPr>
-            <w:shd w:fill="FFFFFF" w:val="clear"/>
-            <w:tcMar>
-              <w:top w:type="dxa" w:w="130"/>
-              <w:left w:type="dxa" w:w="150"/>
-              <w:bottom w:type="dxa" w:w="130"/>
-              <w:right w:type="dxa" w:w="150"/>
+            <w:tcW w:type="dxa" w:w="2800"/>
+            <w:shd w:fill="FFFFFF" w:val="clear"/>
+            <w:tcMar>
+              <w:top w:type="dxa" w:w="130"/>
+              <w:left w:type="dxa" w:w="170"/>
+              <w:bottom w:type="dxa" w:w="130"/>
+              <w:right w:type="dxa" w:w="170"/>
             </w:tcMar>
           </w:tcPr>
           <w:p>
@@ -1549,12 +1586,13 @@
         </w:tc>
         <w:tc>
           <w:tcPr>
-            <w:shd w:fill="FFFFFF" w:val="clear"/>
-            <w:tcMar>
-              <w:top w:type="dxa" w:w="130"/>
-              <w:left w:type="dxa" w:w="150"/>
-              <w:bottom w:type="dxa" w:w="130"/>
-              <w:right w:type="dxa" w:w="150"/>
+            <w:tcW w:type="dxa" w:w="3100"/>
+            <w:shd w:fill="FFFFFF" w:val="clear"/>
+            <w:tcMar>
+              <w:top w:type="dxa" w:w="130"/>
+              <w:left w:type="dxa" w:w="170"/>
+              <w:bottom w:type="dxa" w:w="130"/>
+              <w:right w:type="dxa" w:w="170"/>
             </w:tcMar>
           </w:tcPr>
           <w:p>
@@ -1577,12 +1615,13 @@
       <w:tr>
         <w:tc>
           <w:tcPr>
-            <w:shd w:fill="FFFFFF" w:val="clear"/>
-            <w:tcMar>
-              <w:top w:type="dxa" w:w="130"/>
-              <w:left w:type="dxa" w:w="150"/>
-              <w:bottom w:type="dxa" w:w="130"/>
-              <w:right w:type="dxa" w:w="150"/>
+            <w:tcW w:type="dxa" w:w="1900"/>
+            <w:shd w:fill="FFFFFF" w:val="clear"/>
+            <w:tcMar>
+              <w:top w:type="dxa" w:w="130"/>
+              <w:left w:type="dxa" w:w="170"/>
+              <w:bottom w:type="dxa" w:w="130"/>
+              <w:right w:type="dxa" w:w="170"/>
             </w:tcMar>
           </w:tcPr>
           <w:p>
@@ -1603,12 +1642,13 @@
         </w:tc>
         <w:tc>
           <w:tcPr>
-            <w:shd w:fill="FFFFFF" w:val="clear"/>
-            <w:tcMar>
-              <w:top w:type="dxa" w:w="130"/>
-              <w:left w:type="dxa" w:w="150"/>
-              <w:bottom w:type="dxa" w:w="130"/>
-              <w:right w:type="dxa" w:w="150"/>
+            <w:tcW w:type="dxa" w:w="2500"/>
+            <w:shd w:fill="FFFFFF" w:val="clear"/>
+            <w:tcMar>
+              <w:top w:type="dxa" w:w="130"/>
+              <w:left w:type="dxa" w:w="170"/>
+              <w:bottom w:type="dxa" w:w="130"/>
+              <w:right w:type="dxa" w:w="170"/>
             </w:tcMar>
           </w:tcPr>
           <w:p>
@@ -1629,12 +1669,13 @@
         </w:tc>
         <w:tc>
           <w:tcPr>
-            <w:shd w:fill="FFFFFF" w:val="clear"/>
-            <w:tcMar>
-              <w:top w:type="dxa" w:w="130"/>
-              <w:left w:type="dxa" w:w="150"/>
-              <w:bottom w:type="dxa" w:w="130"/>
-              <w:right w:type="dxa" w:w="150"/>
+            <w:tcW w:type="dxa" w:w="2800"/>
+            <w:shd w:fill="FFFFFF" w:val="clear"/>
+            <w:tcMar>
+              <w:top w:type="dxa" w:w="130"/>
+              <w:left w:type="dxa" w:w="170"/>
+              <w:bottom w:type="dxa" w:w="130"/>
+              <w:right w:type="dxa" w:w="170"/>
             </w:tcMar>
           </w:tcPr>
           <w:p>
@@ -1655,12 +1696,13 @@
         </w:tc>
         <w:tc>
           <w:tcPr>
-            <w:shd w:fill="FFFFFF" w:val="clear"/>
-            <w:tcMar>
-              <w:top w:type="dxa" w:w="130"/>
-              <w:left w:type="dxa" w:w="150"/>
-              <w:bottom w:type="dxa" w:w="130"/>
-              <w:right w:type="dxa" w:w="150"/>
+            <w:tcW w:type="dxa" w:w="3100"/>
+            <w:shd w:fill="FFFFFF" w:val="clear"/>
+            <w:tcMar>
+              <w:top w:type="dxa" w:w="130"/>
+              <w:left w:type="dxa" w:w="170"/>
+              <w:bottom w:type="dxa" w:w="130"/>
+              <w:right w:type="dxa" w:w="170"/>
             </w:tcMar>
           </w:tcPr>
           <w:p>
@@ -1683,12 +1725,13 @@
       <w:tr>
         <w:tc>
           <w:tcPr>
-            <w:shd w:fill="FFFFFF" w:val="clear"/>
-            <w:tcMar>
-              <w:top w:type="dxa" w:w="130"/>
-              <w:left w:type="dxa" w:w="150"/>
-              <w:bottom w:type="dxa" w:w="130"/>
-              <w:right w:type="dxa" w:w="150"/>
+            <w:tcW w:type="dxa" w:w="1900"/>
+            <w:shd w:fill="FFFFFF" w:val="clear"/>
+            <w:tcMar>
+              <w:top w:type="dxa" w:w="130"/>
+              <w:left w:type="dxa" w:w="170"/>
+              <w:bottom w:type="dxa" w:w="130"/>
+              <w:right w:type="dxa" w:w="170"/>
             </w:tcMar>
           </w:tcPr>
           <w:p>
@@ -1709,12 +1752,13 @@
         </w:tc>
         <w:tc>
           <w:tcPr>
-            <w:shd w:fill="FFFFFF" w:val="clear"/>
-            <w:tcMar>
-              <w:top w:type="dxa" w:w="130"/>
-              <w:left w:type="dxa" w:w="150"/>
-              <w:bottom w:type="dxa" w:w="130"/>
-              <w:right w:type="dxa" w:w="150"/>
+            <w:tcW w:type="dxa" w:w="2500"/>
+            <w:shd w:fill="FFFFFF" w:val="clear"/>
+            <w:tcMar>
+              <w:top w:type="dxa" w:w="130"/>
+              <w:left w:type="dxa" w:w="170"/>
+              <w:bottom w:type="dxa" w:w="130"/>
+              <w:right w:type="dxa" w:w="170"/>
             </w:tcMar>
           </w:tcPr>
           <w:p>
@@ -1735,12 +1779,13 @@
         </w:tc>
         <w:tc>
           <w:tcPr>
-            <w:shd w:fill="FFFFFF" w:val="clear"/>
-            <w:tcMar>
-              <w:top w:type="dxa" w:w="130"/>
-              <w:left w:type="dxa" w:w="150"/>
-              <w:bottom w:type="dxa" w:w="130"/>
-              <w:right w:type="dxa" w:w="150"/>
+            <w:tcW w:type="dxa" w:w="2800"/>
+            <w:shd w:fill="FFFFFF" w:val="clear"/>
+            <w:tcMar>
+              <w:top w:type="dxa" w:w="130"/>
+              <w:left w:type="dxa" w:w="170"/>
+              <w:bottom w:type="dxa" w:w="130"/>
+              <w:right w:type="dxa" w:w="170"/>
             </w:tcMar>
           </w:tcPr>
           <w:p>
@@ -1761,12 +1806,13 @@
         </w:tc>
         <w:tc>
           <w:tcPr>
-            <w:shd w:fill="FFFFFF" w:val="clear"/>
-            <w:tcMar>
-              <w:top w:type="dxa" w:w="130"/>
-              <w:left w:type="dxa" w:w="150"/>
-              <w:bottom w:type="dxa" w:w="130"/>
-              <w:right w:type="dxa" w:w="150"/>
+            <w:tcW w:type="dxa" w:w="3100"/>
+            <w:shd w:fill="FFFFFF" w:val="clear"/>
+            <w:tcMar>
+              <w:top w:type="dxa" w:w="130"/>
+              <w:left w:type="dxa" w:w="170"/>
+              <w:bottom w:type="dxa" w:w="130"/>
+              <w:right w:type="dxa" w:w="170"/>
             </w:tcMar>
           </w:tcPr>
           <w:p>
@@ -1789,12 +1835,13 @@
       <w:tr>
         <w:tc>
           <w:tcPr>
-            <w:shd w:fill="FFFFFF" w:val="clear"/>
-            <w:tcMar>
-              <w:top w:type="dxa" w:w="130"/>
-              <w:left w:type="dxa" w:w="150"/>
-              <w:bottom w:type="dxa" w:w="130"/>
-              <w:right w:type="dxa" w:w="150"/>
+            <w:tcW w:type="dxa" w:w="1900"/>
+            <w:shd w:fill="FFFFFF" w:val="clear"/>
+            <w:tcMar>
+              <w:top w:type="dxa" w:w="130"/>
+              <w:left w:type="dxa" w:w="170"/>
+              <w:bottom w:type="dxa" w:w="130"/>
+              <w:right w:type="dxa" w:w="170"/>
             </w:tcMar>
           </w:tcPr>
           <w:p>
@@ -1815,12 +1862,13 @@
         </w:tc>
         <w:tc>
           <w:tcPr>
-            <w:shd w:fill="FFFFFF" w:val="clear"/>
-            <w:tcMar>
-              <w:top w:type="dxa" w:w="130"/>
-              <w:left w:type="dxa" w:w="150"/>
-              <w:bottom w:type="dxa" w:w="130"/>
-              <w:right w:type="dxa" w:w="150"/>
+            <w:tcW w:type="dxa" w:w="2500"/>
+            <w:shd w:fill="FFFFFF" w:val="clear"/>
+            <w:tcMar>
+              <w:top w:type="dxa" w:w="130"/>
+              <w:left w:type="dxa" w:w="170"/>
+              <w:bottom w:type="dxa" w:w="130"/>
+              <w:right w:type="dxa" w:w="170"/>
             </w:tcMar>
           </w:tcPr>
           <w:p>
@@ -1841,12 +1889,13 @@
         </w:tc>
         <w:tc>
           <w:tcPr>
-            <w:shd w:fill="FFFFFF" w:val="clear"/>
-            <w:tcMar>
-              <w:top w:type="dxa" w:w="130"/>
-              <w:left w:type="dxa" w:w="150"/>
-              <w:bottom w:type="dxa" w:w="130"/>
-              <w:right w:type="dxa" w:w="150"/>
+            <w:tcW w:type="dxa" w:w="2800"/>
+            <w:shd w:fill="FFFFFF" w:val="clear"/>
+            <w:tcMar>
+              <w:top w:type="dxa" w:w="130"/>
+              <w:left w:type="dxa" w:w="170"/>
+              <w:bottom w:type="dxa" w:w="130"/>
+              <w:right w:type="dxa" w:w="170"/>
             </w:tcMar>
           </w:tcPr>
           <w:p>
@@ -1867,12 +1916,13 @@
         </w:tc>
         <w:tc>
           <w:tcPr>
-            <w:shd w:fill="FFFFFF" w:val="clear"/>
-            <w:tcMar>
-              <w:top w:type="dxa" w:w="130"/>
-              <w:left w:type="dxa" w:w="150"/>
-              <w:bottom w:type="dxa" w:w="130"/>
-              <w:right w:type="dxa" w:w="150"/>
+            <w:tcW w:type="dxa" w:w="3100"/>
+            <w:shd w:fill="FFFFFF" w:val="clear"/>
+            <w:tcMar>
+              <w:top w:type="dxa" w:w="130"/>
+              <w:left w:type="dxa" w:w="170"/>
+              <w:bottom w:type="dxa" w:w="130"/>
+              <w:right w:type="dxa" w:w="170"/>
             </w:tcMar>
           </w:tcPr>
           <w:p>
@@ -2067,7 +2117,7 @@
     </w:p>
     <w:tbl>
       <w:tblPr>
-        <w:tblW w:type="pct" w:w="100%"/>
+        <w:tblW w:type="dxa" w:w="10300"/>
         <w:tblBorders>
           <w:top w:val="single" w:color="auto" w:sz="4"/>
           <w:left w:val="single" w:color="auto" w:sz="4"/>
@@ -2078,9 +2128,9 @@
         </w:tblBorders>
       </w:tblPr>
       <w:tblGrid>
-        <w:gridCol w:w="100"/>
-        <w:gridCol w:w="100"/>
-        <w:gridCol w:w="100"/>
+        <w:gridCol w:w="2300"/>
+        <w:gridCol w:w="4000"/>
+        <w:gridCol w:w="4000"/>
       </w:tblGrid>
       <w:tr>
         <w:trPr>
@@ -2088,12 +2138,13 @@
         </w:trPr>
         <w:tc>
           <w:tcPr>
+            <w:tcW w:type="dxa" w:w="2300"/>
             <w:shd w:fill="12304A" w:val="clear"/>
             <w:tcMar>
               <w:top w:type="dxa" w:w="130"/>
-              <w:left w:type="dxa" w:w="150"/>
-              <w:bottom w:type="dxa" w:w="130"/>
-              <w:right w:type="dxa" w:w="150"/>
+              <w:left w:type="dxa" w:w="170"/>
+              <w:bottom w:type="dxa" w:w="130"/>
+              <w:right w:type="dxa" w:w="170"/>
             </w:tcMar>
           </w:tcPr>
           <w:p>
@@ -2114,12 +2165,13 @@
         </w:tc>
         <w:tc>
           <w:tcPr>
+            <w:tcW w:type="dxa" w:w="4000"/>
             <w:shd w:fill="12304A" w:val="clear"/>
             <w:tcMar>
               <w:top w:type="dxa" w:w="130"/>
-              <w:left w:type="dxa" w:w="150"/>
-              <w:bottom w:type="dxa" w:w="130"/>
-              <w:right w:type="dxa" w:w="150"/>
+              <w:left w:type="dxa" w:w="170"/>
+              <w:bottom w:type="dxa" w:w="130"/>
+              <w:right w:type="dxa" w:w="170"/>
             </w:tcMar>
           </w:tcPr>
           <w:p>
@@ -2140,12 +2192,13 @@
         </w:tc>
         <w:tc>
           <w:tcPr>
+            <w:tcW w:type="dxa" w:w="4000"/>
             <w:shd w:fill="12304A" w:val="clear"/>
             <w:tcMar>
               <w:top w:type="dxa" w:w="130"/>
-              <w:left w:type="dxa" w:w="150"/>
-              <w:bottom w:type="dxa" w:w="130"/>
-              <w:right w:type="dxa" w:w="150"/>
+              <w:left w:type="dxa" w:w="170"/>
+              <w:bottom w:type="dxa" w:w="130"/>
+              <w:right w:type="dxa" w:w="170"/>
             </w:tcMar>
           </w:tcPr>
           <w:p>
@@ -2168,12 +2221,13 @@
       <w:tr>
         <w:tc>
           <w:tcPr>
-            <w:shd w:fill="FFFFFF" w:val="clear"/>
-            <w:tcMar>
-              <w:top w:type="dxa" w:w="130"/>
-              <w:left w:type="dxa" w:w="150"/>
-              <w:bottom w:type="dxa" w:w="130"/>
-              <w:right w:type="dxa" w:w="150"/>
+            <w:tcW w:type="dxa" w:w="2300"/>
+            <w:shd w:fill="FFFFFF" w:val="clear"/>
+            <w:tcMar>
+              <w:top w:type="dxa" w:w="130"/>
+              <w:left w:type="dxa" w:w="170"/>
+              <w:bottom w:type="dxa" w:w="130"/>
+              <w:right w:type="dxa" w:w="170"/>
             </w:tcMar>
           </w:tcPr>
           <w:p>
@@ -2194,12 +2248,13 @@
         </w:tc>
         <w:tc>
           <w:tcPr>
-            <w:shd w:fill="FFFFFF" w:val="clear"/>
-            <w:tcMar>
-              <w:top w:type="dxa" w:w="130"/>
-              <w:left w:type="dxa" w:w="150"/>
-              <w:bottom w:type="dxa" w:w="130"/>
-              <w:right w:type="dxa" w:w="150"/>
+            <w:tcW w:type="dxa" w:w="4000"/>
+            <w:shd w:fill="FFFFFF" w:val="clear"/>
+            <w:tcMar>
+              <w:top w:type="dxa" w:w="130"/>
+              <w:left w:type="dxa" w:w="170"/>
+              <w:bottom w:type="dxa" w:w="130"/>
+              <w:right w:type="dxa" w:w="170"/>
             </w:tcMar>
           </w:tcPr>
           <w:p>
@@ -2220,12 +2275,13 @@
         </w:tc>
         <w:tc>
           <w:tcPr>
-            <w:shd w:fill="FFFFFF" w:val="clear"/>
-            <w:tcMar>
-              <w:top w:type="dxa" w:w="130"/>
-              <w:left w:type="dxa" w:w="150"/>
-              <w:bottom w:type="dxa" w:w="130"/>
-              <w:right w:type="dxa" w:w="150"/>
+            <w:tcW w:type="dxa" w:w="4000"/>
+            <w:shd w:fill="FFFFFF" w:val="clear"/>
+            <w:tcMar>
+              <w:top w:type="dxa" w:w="130"/>
+              <w:left w:type="dxa" w:w="170"/>
+              <w:bottom w:type="dxa" w:w="130"/>
+              <w:right w:type="dxa" w:w="170"/>
             </w:tcMar>
           </w:tcPr>
           <w:p>
@@ -2248,12 +2304,13 @@
       <w:tr>
         <w:tc>
           <w:tcPr>
-            <w:shd w:fill="FFFFFF" w:val="clear"/>
-            <w:tcMar>
-              <w:top w:type="dxa" w:w="130"/>
-              <w:left w:type="dxa" w:w="150"/>
-              <w:bottom w:type="dxa" w:w="130"/>
-              <w:right w:type="dxa" w:w="150"/>
+            <w:tcW w:type="dxa" w:w="2300"/>
+            <w:shd w:fill="FFFFFF" w:val="clear"/>
+            <w:tcMar>
+              <w:top w:type="dxa" w:w="130"/>
+              <w:left w:type="dxa" w:w="170"/>
+              <w:bottom w:type="dxa" w:w="130"/>
+              <w:right w:type="dxa" w:w="170"/>
             </w:tcMar>
           </w:tcPr>
           <w:p>
@@ -2274,12 +2331,13 @@
         </w:tc>
         <w:tc>
           <w:tcPr>
-            <w:shd w:fill="FFFFFF" w:val="clear"/>
-            <w:tcMar>
-              <w:top w:type="dxa" w:w="130"/>
-              <w:left w:type="dxa" w:w="150"/>
-              <w:bottom w:type="dxa" w:w="130"/>
-              <w:right w:type="dxa" w:w="150"/>
+            <w:tcW w:type="dxa" w:w="4000"/>
+            <w:shd w:fill="FFFFFF" w:val="clear"/>
+            <w:tcMar>
+              <w:top w:type="dxa" w:w="130"/>
+              <w:left w:type="dxa" w:w="170"/>
+              <w:bottom w:type="dxa" w:w="130"/>
+              <w:right w:type="dxa" w:w="170"/>
             </w:tcMar>
           </w:tcPr>
           <w:p>
@@ -2300,12 +2358,13 @@
         </w:tc>
         <w:tc>
           <w:tcPr>
-            <w:shd w:fill="FFFFFF" w:val="clear"/>
-            <w:tcMar>
-              <w:top w:type="dxa" w:w="130"/>
-              <w:left w:type="dxa" w:w="150"/>
-              <w:bottom w:type="dxa" w:w="130"/>
-              <w:right w:type="dxa" w:w="150"/>
+            <w:tcW w:type="dxa" w:w="4000"/>
+            <w:shd w:fill="FFFFFF" w:val="clear"/>
+            <w:tcMar>
+              <w:top w:type="dxa" w:w="130"/>
+              <w:left w:type="dxa" w:w="170"/>
+              <w:bottom w:type="dxa" w:w="130"/>
+              <w:right w:type="dxa" w:w="170"/>
             </w:tcMar>
           </w:tcPr>
           <w:p>
@@ -2328,12 +2387,13 @@
       <w:tr>
         <w:tc>
           <w:tcPr>
-            <w:shd w:fill="FFFFFF" w:val="clear"/>
-            <w:tcMar>
-              <w:top w:type="dxa" w:w="130"/>
-              <w:left w:type="dxa" w:w="150"/>
-              <w:bottom w:type="dxa" w:w="130"/>
-              <w:right w:type="dxa" w:w="150"/>
+            <w:tcW w:type="dxa" w:w="2300"/>
+            <w:shd w:fill="FFFFFF" w:val="clear"/>
+            <w:tcMar>
+              <w:top w:type="dxa" w:w="130"/>
+              <w:left w:type="dxa" w:w="170"/>
+              <w:bottom w:type="dxa" w:w="130"/>
+              <w:right w:type="dxa" w:w="170"/>
             </w:tcMar>
           </w:tcPr>
           <w:p>
@@ -2354,12 +2414,13 @@
         </w:tc>
         <w:tc>
           <w:tcPr>
-            <w:shd w:fill="FFFFFF" w:val="clear"/>
-            <w:tcMar>
-              <w:top w:type="dxa" w:w="130"/>
-              <w:left w:type="dxa" w:w="150"/>
-              <w:bottom w:type="dxa" w:w="130"/>
-              <w:right w:type="dxa" w:w="150"/>
+            <w:tcW w:type="dxa" w:w="4000"/>
+            <w:shd w:fill="FFFFFF" w:val="clear"/>
+            <w:tcMar>
+              <w:top w:type="dxa" w:w="130"/>
+              <w:left w:type="dxa" w:w="170"/>
+              <w:bottom w:type="dxa" w:w="130"/>
+              <w:right w:type="dxa" w:w="170"/>
             </w:tcMar>
           </w:tcPr>
           <w:p>
@@ -2380,12 +2441,13 @@
         </w:tc>
         <w:tc>
           <w:tcPr>
-            <w:shd w:fill="FFFFFF" w:val="clear"/>
-            <w:tcMar>
-              <w:top w:type="dxa" w:w="130"/>
-              <w:left w:type="dxa" w:w="150"/>
-              <w:bottom w:type="dxa" w:w="130"/>
-              <w:right w:type="dxa" w:w="150"/>
+            <w:tcW w:type="dxa" w:w="4000"/>
+            <w:shd w:fill="FFFFFF" w:val="clear"/>
+            <w:tcMar>
+              <w:top w:type="dxa" w:w="130"/>
+              <w:left w:type="dxa" w:w="170"/>
+              <w:bottom w:type="dxa" w:w="130"/>
+              <w:right w:type="dxa" w:w="170"/>
             </w:tcMar>
           </w:tcPr>
           <w:p>
@@ -2408,12 +2470,13 @@
       <w:tr>
         <w:tc>
           <w:tcPr>
-            <w:shd w:fill="FFFFFF" w:val="clear"/>
-            <w:tcMar>
-              <w:top w:type="dxa" w:w="130"/>
-              <w:left w:type="dxa" w:w="150"/>
-              <w:bottom w:type="dxa" w:w="130"/>
-              <w:right w:type="dxa" w:w="150"/>
+            <w:tcW w:type="dxa" w:w="2300"/>
+            <w:shd w:fill="FFFFFF" w:val="clear"/>
+            <w:tcMar>
+              <w:top w:type="dxa" w:w="130"/>
+              <w:left w:type="dxa" w:w="170"/>
+              <w:bottom w:type="dxa" w:w="130"/>
+              <w:right w:type="dxa" w:w="170"/>
             </w:tcMar>
           </w:tcPr>
           <w:p>
@@ -2434,12 +2497,13 @@
         </w:tc>
         <w:tc>
           <w:tcPr>
-            <w:shd w:fill="FFFFFF" w:val="clear"/>
-            <w:tcMar>
-              <w:top w:type="dxa" w:w="130"/>
-              <w:left w:type="dxa" w:w="150"/>
-              <w:bottom w:type="dxa" w:w="130"/>
-              <w:right w:type="dxa" w:w="150"/>
+            <w:tcW w:type="dxa" w:w="4000"/>
+            <w:shd w:fill="FFFFFF" w:val="clear"/>
+            <w:tcMar>
+              <w:top w:type="dxa" w:w="130"/>
+              <w:left w:type="dxa" w:w="170"/>
+              <w:bottom w:type="dxa" w:w="130"/>
+              <w:right w:type="dxa" w:w="170"/>
             </w:tcMar>
           </w:tcPr>
           <w:p>
@@ -2460,12 +2524,13 @@
         </w:tc>
         <w:tc>
           <w:tcPr>
-            <w:shd w:fill="FFFFFF" w:val="clear"/>
-            <w:tcMar>
-              <w:top w:type="dxa" w:w="130"/>
-              <w:left w:type="dxa" w:w="150"/>
-              <w:bottom w:type="dxa" w:w="130"/>
-              <w:right w:type="dxa" w:w="150"/>
+            <w:tcW w:type="dxa" w:w="4000"/>
+            <w:shd w:fill="FFFFFF" w:val="clear"/>
+            <w:tcMar>
+              <w:top w:type="dxa" w:w="130"/>
+              <w:left w:type="dxa" w:w="170"/>
+              <w:bottom w:type="dxa" w:w="130"/>
+              <w:right w:type="dxa" w:w="170"/>
             </w:tcMar>
           </w:tcPr>
           <w:p>
@@ -2486,6 +2551,11 @@
         </w:tc>
       </w:tr>
     </w:tbl>
+    <w:p>
+      <w:r>
+        <w:br w:type="page"/>
+      </w:r>
+    </w:p>
     <w:p>
       <w:pPr>
         <w:pStyle w:val="Heading1"/>

</xml_diff>